<commit_message>
Sync revised Student_Package and stacked scenario data interface
</commit_message>
<xml_diff>
--- a/COMP565_PRSAgents_project_description.docx
+++ b/COMP565_PRSAgents_project_description.docx
@@ -111,7 +111,7 @@
         <w:pStyle w:val="FirstParagraph"/>
       </w:pPr>
       <w:r>
-        <w:t>Simulated founder haplotypes are split into disjoint source and target pools before cohort synthesis. Individuals are built as mosaics of founder haplotype blocks, preserving linkage structure within each block. Target individuals draw blocks from several ancestries.</w:t>
+        <w:t>Simulated founder haplotypes are split into disjoint source and target pools before cohort synthesis. Individuals are built as mosaics of founder haplotype blocks, preserving linkage structure within each block. Target individuals draw blocks from several ancestries. The causal variants are deliberately placed outside the 1,000 typed variants, so every source score must tag them through its own population's linkage disequilibrium. That is why a score can transfer poorly even when causal effects are identical, and why no model reaches the oracle. All replicates draw from one founder haplotype library, so they are independent draws of causal variants, effects and individuals, but not of the underlying population history.</w:t>
       </w:r>
     </w:p>
     <w:p>
@@ -127,7 +127,7 @@
         <w:pStyle w:val="FirstParagraph"/>
       </w:pPr>
       <w:r>
-        <w:t>Download or clone the scripts, guides, and project description from github.com/yueliyl/PRSAgents. Download PRSAgents_Data.zip from the latest GitHub release and extract its data folder into the repository root, beside harness.py and README.md. The repository README gives the file guide and setup instructions; it is the current reference for the supplied files. Run all commands from the repository root after installing the Python requirements.</w:t>
+        <w:t>Download or clone the scripts, guides, and project description from github.com/yueliyl/PRSAgents. Download PRSAgents_Data.zip from the latest GitHub release and extract its data folder into the repository root, beside harness.py and README.md. The repository README gives the file guide and setup instructions; it is the current reference for the supplied files. data/README.md, inside the data download, documents every file, array shape and known pitfall. Run all commands from the repository root after installing the Python requirements.</w:t>
       </w:r>
     </w:p>
     <w:p>
@@ -151,7 +151,7 @@
         <w:pStyle w:val="FirstParagraph"/>
       </w:pPr>
       <w:r>
-        <w:t>You receive four anonymous generating settings, with ten replicates per setting. Each setting follows one of the four regimes below; its identity is withheld. Infer the setting from evidence where requested, and do not pass the hidden answer to the AI controller.</w:t>
+        <w:t>The data folder holds four scenarios, each named after the structure it plants, with ten independent replicates per scenario. Each follows one of the four rows below. Your task is not to work out which is which; it is to show with evidence that the structure is present and that your model captures it.</w:t>
       </w:r>
     </w:p>
     <w:tbl>
@@ -178,7 +178,7 @@
               <w:pStyle w:val="Compact"/>
             </w:pPr>
             <w:r>
-              <w:t xml:space="preserve">Regime</w:t>
+              <w:t xml:space="preserve">Scenario (folder)</w:t>
             </w:r>
           </w:p>
         </w:tc>
@@ -216,7 +216,7 @@
               <w:pStyle w:val="Compact"/>
             </w:pPr>
             <w:r>
-              <w:t xml:space="preserve">Shared</w:t>
+              <w:t xml:space="preserve">shared_effects</w:t>
             </w:r>
           </w:p>
         </w:tc>
@@ -254,7 +254,7 @@
               <w:pStyle w:val="Compact"/>
             </w:pPr>
             <w:r>
-              <w:t xml:space="preserve">Ancestry-dependent</w:t>
+              <w:t xml:space="preserve">ancestry_dependent</w:t>
             </w:r>
           </w:p>
         </w:tc>
@@ -292,7 +292,7 @@
               <w:pStyle w:val="Compact"/>
             </w:pPr>
             <w:r>
-              <w:t xml:space="preserve">Locus-varying</w:t>
+              <w:t xml:space="preserve">locus_varying</w:t>
             </w:r>
           </w:p>
         </w:tc>
@@ -330,7 +330,7 @@
               <w:pStyle w:val="Compact"/>
             </w:pPr>
             <w:r>
-              <w:t xml:space="preserve">Non-linear</w:t>
+              <w:t xml:space="preserve">nonlinear_link</w:t>
             </w:r>
           </w:p>
         </w:tc>
@@ -363,7 +363,7 @@
         <w:pStyle w:val="BodyText"/>
       </w:pPr>
       <w:r>
-        <w:t>Use the instructor-designated development dataset to check the baseline. Shared-effect simulations illustrate that poor transfer can occur even with identical causal effects. Do not expose regime labels to the agent on assessment datasets.</w:t>
+        <w:t>Use one scenario and replicate to debug, then freeze your prompt, tools, candidate space and selection rule before running the rest. The shared_effects scenario is the instructive one: transfer is poor there even though causal effects are identical in every ancestry, so linkage disequilibrium and allele frequency differences alone account for most of the portability problem.</w:t>
       </w:r>
     </w:p>
     <w:p>
@@ -387,7 +387,7 @@
         <w:pStyle w:val="BodyText"/>
       </w:pPr>
       <w:r>
-        <w:t>Use the provided target split: 2,000 training, 800 validation, and 1,200 test individuals. Fit target-cohort parameters using training labels. Validation supports predeclared selection or confirmation; instructor-held test labels are never used for fitting or agent decisions. The separate Stage 1 transfer cohorts have provided phenotypes for portability assessment and are not the target test split.</w:t>
+        <w:t>Each scenario's ten replicates are independently simulated cohorts, not cross-validation folds. Differences between methods here are roughly 0.003 to 0.007 in incremental R2 and the standard error on a single replicate is about the same size, so compare methods paired within replicate and report the mean difference across the ten with its standard error. Use the provided target split: 2,000 training, 800 validation, and 1,200 test individuals. Fit on the training split only; refitting on training plus validation is a different experiment and must be reported as one. Fit target-cohort parameters using training labels. Validation supports predeclared selection or confirmation; instructor-held test labels are never used for fitting or agent decisions. The separate Stage 1 transfer cohorts have provided phenotypes for portability assessment and are not the target test split.</w:t>
       </w:r>
     </w:p>
     <w:p>
@@ -510,7 +510,7 @@
         <w:rPr>
           <w:rStyle w:val="VerbatimChar"/>
         </w:rPr>
-        <w:t>python stages/stage1_fit.py data/datasets/dataset_01/rep00</w:t>
+        <w:t>python stages/stage1_fit.py data/shared_effects --replicate 0</w:t>
       </w:r>
     </w:p>
     <w:p>
@@ -1270,9 +1270,9 @@
         <w:pStyle w:val="SourceCode"/>
       </w:pPr>
       <w:r>
-        <w:t>python stage2_demo.py data/datasets/dataset_01/rep00</w:t>
+        <w:t>python stage2_demo.py data/shared_effects --replicate 0</w:t>
         <w:br/>
-        <w:t>python stage2_baselines.py data/datasets/dataset_01/rep00</w:t>
+        <w:t>python stage2_baselines.py data/shared_effects --replicate 0</w:t>
       </w:r>
     </w:p>
     <w:p>
@@ -1424,18 +1424,8 @@
           <w:rStyle w:val="VerbatimChar"/>
         </w:rPr>
         <w:t>python3 -m venv .venv</w:t>
-      </w:r>
-      <w:r>
-        <w:rPr>
-          <w:rStyle w:val="VerbatimChar"/>
-        </w:rPr>
         <w:br/>
         <w:t>source .venv/bin/activate</w:t>
-      </w:r>
-      <w:r>
-        <w:rPr>
-          <w:rStyle w:val="VerbatimChar"/>
-        </w:rPr>
         <w:br/>
         <w:t>python -m pip install -r requirements.txt</w:t>
       </w:r>
@@ -1474,20 +1464,10 @@
           <w:rStyle w:val="VerbatimChar"/>
         </w:rPr>
         <w:t>python qwen_prs_agent.py --project .</w:t>
-      </w:r>
-      <w:r>
-        <w:rPr>
-          <w:rStyle w:val="VerbatimChar"/>
-        </w:rPr>
         <w:br/>
-        <w:t>    --data data/datasets/dataset_01/rep00 --model qwen3:8b</w:t>
-      </w:r>
-      <w:r>
-        <w:rPr>
-          <w:rStyle w:val="VerbatimChar"/>
-        </w:rPr>
+        <w:t xml:space="preserve">    --data data/shared_effects --replicate 0 --model qwen3:8b</w:t>
         <w:br/>
-        <w:t>    --budget 6 --out outputs/qwen_demo</w:t>
+        <w:t xml:space="preserve">    --budget 6 --out outputs/qwen_demo</w:t>
       </w:r>
     </w:p>
     <w:p>
@@ -2197,7 +2177,7 @@
         </m:sSup>
       </m:oMath>
       <w:r>
-        <w:t xml:space="preserve"> side by side. The gap will be larger than you expect. That gap is a finding, not an embarrassment.</w:t>
+        <w:t xml:space="preserve"> side by side, once the instructor returns test scores after submission. Before then, compare your validation score against a cross-validated estimate on the training split. Either gap will be larger than you expect, and the gap is a finding, not an embarrassment.</w:t>
       </w:r>
     </w:p>
     <w:p>
@@ -2387,7 +2367,7 @@
               <w:pStyle w:val="Compact"/>
             </w:pPr>
             <w:r>
-              <w:t xml:space="preserve">Regime identification and analysis</w:t>
+              <w:t xml:space="preserve">Scenario analysis: evidence that the planted structure is present and that your model exploits it</w:t>
             </w:r>
           </w:p>
         </w:tc>

</xml_diff>

<commit_message>
Sync updated Student_Package descriptions, README and manifest
</commit_message>
<xml_diff>
--- a/COMP565_PRSAgents_project_description.docx
+++ b/COMP565_PRSAgents_project_description.docx
@@ -419,7 +419,7 @@
         <w:pStyle w:val="FirstParagraph"/>
       </w:pPr>
       <w:r>
-        <w:t>The release provides &lt;dataset&gt;/stage1/sumstats.npz with per-source marginal effects, uncertainty and sample sizes, and data/stage1/ld/ld_&lt;POP&gt;.npz with the corresponding block-diagonal LD matrices. Use the variant/block map included with the summary statistics. Fit VIPRS with a spike-and-slab prior and mean-field variational inference. Adapt your Assignment 1 implementation, exploiting the independent LD blocks for coordinate updates. Document the prior, initialization, convergence criterion, and any source-only hyperparameter choices.</w:t>
+        <w:t>The release provides data/&lt;scenario&gt;/sumstats.npz with per-source marginal effects, uncertainty and sample sizes for every replicate, and data/common/ld_&lt;POP&gt;.npz with the corresponding LD matrices, shared by all scenarios. The ten blocks are unlinked by construction, but those matrices are estimated from genotypes, so entries between blocks are sampling noise rather than exactly zero; sweeping within a block is correct and discards only that noise. Use the variant/block map included with the summary statistics. Fit VIPRS with a spike-and-slab prior and mean-field variational inference. Adapt your Assignment 1 implementation, exploiting the independent LD blocks for coordinate updates. Document the prior, initialization, convergence criterion, and any source-only hyperparameter choices.</w:t>
       </w:r>
     </w:p>
     <w:p>
@@ -443,7 +443,7 @@
         <w:pStyle w:val="FirstParagraph"/>
       </w:pPr>
       <w:r>
-        <w:t xml:space="preserve">Use data/stage1/eval_genotypes.npz and &lt;dataset&gt;/stage1/eval_phenotypes.npz to assess every source PRS in every provided transfer cohort: AFR, EUR, SAS, EAS, NAT, and admixed AMR. These six cohorts contain 1,500 individuals each. Produce a five-row by six-column transfer matrix using incremental </w:t>
+        <w:t xml:space="preserve">Use data/common/eval_genotypes.npz and data/&lt;scenario&gt;/eval_phenotypes.npz to assess every source PRS in every provided transfer cohort: AFR, EUR, SAS, EAS, NAT, and admixed AMR. These six cohorts contain 1,500 individuals each. Produce a five-row by six-column transfer matrix using incremental </w:t>
       </w:r>
       <m:oMath>
         <m:sSup>
@@ -482,7 +482,7 @@
         <w:pStyle w:val="BodyText"/>
       </w:pPr>
       <w:r>
-        <w:t>Across assigned replicates, report mean transfer accuracy and uncertainty. Discuss ancestry-matched versus off-diagonal entries, the EUR score's accuracy in AFR relative to its accuracy in EUR, unequal discovery sizes, and the absence of a NAT discovery expert. Compare shared-effect and heterogeneous-effect settings where their identities are supplied for analysis; keep assessment regime labels out of the Stage 3 model context. Poor transfer in the shared-effect setting is evidence that effect divergence is not the only mechanism.</w:t>
+        <w:t>Across assigned replicates, report mean transfer accuracy and uncertainty. Discuss ancestry-matched versus off-diagonal entries, the EUR score's accuracy in AFR relative to its accuracy in EUR, unequal discovery sizes, and the absence of a NAT discovery expert. Compare the shared_effects and ancestry_dependent scenarios directly. Poor transfer in the shared-effect setting is evidence that effect divergence is not the only mechanism.</w:t>
       </w:r>
     </w:p>
     <w:p>
@@ -498,7 +498,7 @@
         <w:pStyle w:val="FirstParagraph"/>
       </w:pPr>
       <w:r>
-        <w:t>Use stages/stage1_fit.py as the input-loading and transfer-table reference. From the project directory, this command runs the reference check; replace its example path with the assigned dataset:</w:t>
+        <w:t>Use stages/stage1_fit.py as the input-loading and transfer-table reference. From the project directory, this command runs the reference check; replace the example path with your assigned scenario and replicate:</w:t>
       </w:r>
     </w:p>
     <w:p>
@@ -1641,7 +1641,7 @@
         <w:pStyle w:val="FirstParagraph"/>
       </w:pPr>
       <w:r>
-        <w:t>Compare Stage 2, the Ollama/Qwen agent, and fixed or random search over the same permitted candidate space. Give both search controllers identical candidate budgets, folds, and confirmation rules. Use development runs to debug and then freeze prompts, tools, settings, candidate space, and selection rules before final assessment. Do not expose test labels, hidden regime information, or instructor oracle metadata to the LLM.</w:t>
+        <w:t>Compare Stage 2, the Ollama/Qwen agent, and fixed or random search over the same permitted candidate space. Give both search controllers identical candidate budgets, folds, and confirmation rules. Use development runs to debug and then freeze prompts, tools, settings, candidate space, and selection rules before final assessment. Do not expose test labels or instructor oracle metadata to the LLM.</w:t>
       </w:r>
     </w:p>
     <w:p>
@@ -1649,7 +1649,7 @@
         <w:pStyle w:val="BodyText"/>
       </w:pPr>
       <w:r>
-        <w:t>Submit runnable code and setup instructions, complete traces, a table of cross-validation and confirmation results with paired uncertainty, evaluation/fit/runtime logs, and test predictions for all three methods on every assigned dataset and replicate. Explain whether the AI decisions improved performance or efficiency and why each retained change was justified. A well-supported negative result or justified retention of Stage 2 receives full credit for the investigation. See stages/STAGE3_OLLAMA.md for the full protocol and official Ollama references.</w:t>
+        <w:t>Submit runnable code and setup instructions, complete traces, a table of cross-validation and confirmation results with paired uncertainty, evaluation/fit/runtime logs, and test predictions for all three methods on every assigned scenario and replicate. Explain whether the AI decisions improved performance or efficiency and why each retained change was justified. A well-supported negative result or justified retention of Stage 2 receives full credit for the investigation. See stages/STAGE3_OLLAMA.md for the full protocol and official Ollama references.</w:t>
       </w:r>
     </w:p>
     <w:p>
@@ -1665,7 +1665,7 @@
         <w:pStyle w:val="FirstParagraph"/>
       </w:pPr>
       <w:r>
-        <w:t>The required core comparison is best single PRS, MultiPRS, genotype ridge, and Stage 2 MoEPRS on every assigned dataset. The remaining methods are optional comparators. Stage 3 additionally requires fixed or random search under the same budget as the AI controller.</w:t>
+        <w:t>The required core comparison is best single PRS, MultiPRS, genotype ridge, and Stage 2 MoEPRS on every assigned scenario. The remaining methods are optional comparators. Stage 3 additionally requires fixed or random search under the same budget as the AI controller.</w:t>
       </w:r>
     </w:p>
     <w:tbl>
@@ -2185,7 +2185,7 @@
         <w:pStyle w:val="BodyText"/>
       </w:pPr>
       <w:r>
-        <w:t>Submit frozen test predictions for instructor assessment. Test feedback must not enter the Stage 3 search or be used to revise its policy. Run all assigned simulation replicates; when ten per regime are provided, report paired means and standard errors over those ten. Distinguish validation results from test results supplied by the instructor.</w:t>
+        <w:t>Submit frozen test predictions for instructor assessment. The 1,200 test individuals are present in the data with their genotypes, source scores and covariates; only their phenotypes are withheld, appearing as NaN in labels.npz where split equals 2. Harness.submit writes the required iid,prediction CSV for exactly those individuals. Test feedback must not enter the Stage 3 search or be used to revise its policy. Run all assigned simulation replicates; when ten per scenario are provided, report paired means and standard errors over those ten. Distinguish validation results from test results supplied by the instructor.</w:t>
       </w:r>
     </w:p>
     <w:p>
@@ -2217,15 +2217,7 @@
         <w:pStyle w:val="Compact"/>
       </w:pPr>
       <w:r>
-        <w:t>3. Report, 6 to 8 pages: Stage 1 transfer matrices and portability analysis; Stage 2 baseline contrasts, gate plots, and sample-size sweep; Stage 3 agent/comparison results and interpretation; oracle assessment and regime identification where applicable.</w:t>
-      </w:r>
-    </w:p>
-    <w:p>
-      <w:pPr>
-        <w:pStyle w:val="Compact"/>
-      </w:pPr>
-      <w:r>
-        <w:t>4. Presentation, 10 minutes plus questions.</w:t>
+        <w:t>3. Report, 6 to 8 pages: Stage 1 transfer matrices and portability analysis; Stage 2 baseline contrasts, gate plots, and sample-size sweep; Stage 3 agent/comparison results and interpretation; oracle assessment and scenario analysis.</w:t>
       </w:r>
     </w:p>
     <w:p>
@@ -2394,7 +2386,7 @@
               <w:pStyle w:val="Compact"/>
             </w:pPr>
             <w:r>
-              <w:t xml:space="preserve">Report and presentation</w:t>
+              <w:t xml:space="preserve">Report clarity</w:t>
             </w:r>
           </w:p>
         </w:tc>
@@ -2620,7 +2612,7 @@
               <w:pStyle w:val="Compact"/>
             </w:pPr>
             <w:r>
-              <w:t>Complete three-stage report and presentation</w:t>
+              <w:t>Complete three-stage report</w:t>
             </w:r>
           </w:p>
         </w:tc>
@@ -2651,6 +2643,7 @@
       </w:r>
     </w:p>
     <w:sectPr>
+      <w:footerReference w:type="default" r:id="rId60"/>
       <w:pgSz w:h="15840" w:w="12240"/>
       <w:pgMar w:bottom="1134" w:footer="709" w:gutter="0" w:header="709" w:left="1134" w:right="1134" w:top="1134"/>
     </w:sectPr>
@@ -2660,6 +2653,61 @@
 
 <file path=word/comments.xml><?xml version="1.0" encoding="utf-8"?>
 <w:comments xmlns:w="http://schemas.openxmlformats.org/wordprocessingml/2006/main" xmlns:m="http://schemas.openxmlformats.org/officeDocument/2006/math" xmlns:r="http://schemas.openxmlformats.org/officeDocument/2006/relationships" xmlns:o="urn:schemas-microsoft-com:office:office" xmlns:v="urn:schemas-microsoft-com:vml" xmlns:w10="urn:schemas-microsoft-com:office:word" xmlns:a="http://schemas.openxmlformats.org/drawingml/2006/main" xmlns:pic="http://schemas.openxmlformats.org/drawingml/2006/picture" xmlns:wp="http://schemas.openxmlformats.org/drawingml/2006/wordprocessingDrawing"/>
+</file>
+
+<file path=word/footer1.xml><?xml version="1.0" encoding="utf-8"?>
+<w:ftr xmlns:w="http://schemas.openxmlformats.org/wordprocessingml/2006/main" xmlns:r="http://schemas.openxmlformats.org/officeDocument/2006/relationships">
+  <w:p>
+    <w:pPr>
+      <w:jc w:val="center"/>
+      <w:rPr>
+        <w:sz w:val="18"/>
+      </w:rPr>
+    </w:pPr>
+    <w:r>
+      <w:rPr>
+        <w:sz w:val="18"/>
+      </w:rPr>
+      <w:t xml:space="preserve">Page </w:t>
+    </w:r>
+    <w:r>
+      <w:fldChar w:fldCharType="begin"/>
+    </w:r>
+    <w:r>
+      <w:instrText xml:space="preserve"> PAGE </w:instrText>
+    </w:r>
+    <w:r>
+      <w:fldChar w:fldCharType="separate"/>
+    </w:r>
+    <w:r>
+      <w:t>1</w:t>
+    </w:r>
+    <w:r>
+      <w:fldChar w:fldCharType="end"/>
+    </w:r>
+    <w:r>
+      <w:rPr>
+        <w:sz w:val="18"/>
+      </w:rPr>
+      <w:t xml:space="preserve"> of </w:t>
+    </w:r>
+    <w:r>
+      <w:fldChar w:fldCharType="begin"/>
+    </w:r>
+    <w:r>
+      <w:instrText xml:space="preserve"> NUMPAGES </w:instrText>
+    </w:r>
+    <w:r>
+      <w:fldChar w:fldCharType="separate"/>
+    </w:r>
+    <w:r>
+      <w:t>8</w:t>
+    </w:r>
+    <w:r>
+      <w:fldChar w:fldCharType="end"/>
+    </w:r>
+  </w:p>
+</w:ftr>
 </file>
 
 <file path=word/footnotes.xml><?xml version="1.0" encoding="utf-8"?>

</xml_diff>